<commit_message>
Update all Sprouts AI work sample files
Co-Authored-By: Claude Sonnet 4.6 <noreply@anthropic.com>
</commit_message>
<xml_diff>
--- a/public/work-samples/Sprouts_AI_Customer_OnePager.docx
+++ b/public/work-samples/Sprouts_AI_Customer_OnePager.docx
@@ -82,7 +82,7 @@
                 <w:sz w:val="22"/>
                 <w:szCs w:val="22"/>
               </w:rPr>
-              <w:t xml:space="preserve">The Agentic Recruiting Platform that runs your end-to-end hiring workflow — so your team focuses on decisions, not coordination.</w:t>
+              <w:t>The Agentic Recruiting Platform that runs your end-to-end hiring workflow - so your team focuses on decisions, not coordination.</w:t>
             </w:r>
           </w:p>
         </w:tc>
@@ -158,7 +158,7 @@
                 <w:sz w:val="19"/>
                 <w:szCs w:val="19"/>
               </w:rPr>
-              <w:t xml:space="preserve">Most recruiting tools make individual tasks faster. But recruiters are still stuck coordinating the work between tools — scheduling, following up, updating the ATS, chasing hiring managers.</w:t>
+              <w:t>Most recruiting tools make individual tasks faster. But recruiters are still stuck coordinating the work between tools - scheduling, following up, updating the ATS, chasing hiring managers.</w:t>
             </w:r>
           </w:p>
           <w:p>
@@ -504,7 +504,7 @@
                 <w:sz w:val="18"/>
                 <w:szCs w:val="18"/>
               </w:rPr>
-              <w:t xml:space="preserve">Sprouts sources, reaches out, screens candidates, and schedules interviews — end to end.</w:t>
+              <w:t>Sprouts sources, reaches out, screens candidates, and schedules interviews - end to end.</w:t>
             </w:r>
           </w:p>
         </w:tc>

</xml_diff>